<commit_message>
feat(agent-06): expand clubs knowledge with class congress procedures and recruitment playbook
</commit_message>
<xml_diff>
--- a/subspaces/02-student-services/clubs-activities-agent/agent/knowledge.docx
+++ b/subspaces/02-student-services/clubs-activities-agent/agent/knowledge.docx
@@ -4468,6 +4468,306 @@
         <w:t>• Nút dây dã ngoại cơ bản: Nút thuyền chài (buộc thuyền/cột lều), nút dẹt (nối hai đầu dây bằng nhau), nút ghế đơn (cứu người từ trên cao/dưới giếng), nút thòng lọng, nút chân chó (rút ngắn dây bị sờn).</w:t>
       </w:r>
     </w:p>
+    <w:p>
+      <w:pPr>
+        <w:pStyle w:val="Heading1"/>
+        <w:spacing w:before="280" w:after="120"/>
+      </w:pPr>
+      <w:r>
+        <w:rPr>
+          <w:rFonts w:ascii="Times New Roman" w:hAnsi="Times New Roman"/>
+          <w:b/>
+          <w:color w:val="003366"/>
+          <w:sz w:val="28"/>
+        </w:rPr>
+        <w:t>PHẦN 11: CẨM NANG TỔ CHỨC ĐẠI HỘI CHI ĐOÀN - CHI HỘI SINH VIÊN THEO ĐIỀU LỆ</w:t>
+      </w:r>
+    </w:p>
+    <w:p>
+      <w:pPr>
+        <w:spacing w:after="80" w:line="276" w:lineRule="auto"/>
+      </w:pPr>
+      <w:r>
+        <w:rPr>
+          <w:rFonts w:ascii="Times New Roman" w:hAnsi="Times New Roman"/>
+          <w:sz w:val="22"/>
+        </w:rPr>
+        <w:t>Đại hội Chi đoàn - Chi hội lớp là đợt sinh hoạt chính trị sâu rộng hàng năm của đoàn viên, hội viên sinh viên nhằm tổng kết nhiệm kỳ cũ và hiệp thương bầu Ban Chấp hành nhiệm kỳ mới:</w:t>
+      </w:r>
+    </w:p>
+    <w:p>
+      <w:pPr>
+        <w:pStyle w:val="Heading2"/>
+        <w:spacing w:before="200" w:after="80"/>
+      </w:pPr>
+      <w:r>
+        <w:rPr>
+          <w:rFonts w:ascii="Times New Roman" w:hAnsi="Times New Roman"/>
+          <w:b/>
+          <w:color w:val="1B365D"/>
+          <w:sz w:val="24"/>
+        </w:rPr>
+        <w:t>11.1. Các Bước Chuẩn bị Trước Đại hội</w:t>
+      </w:r>
+    </w:p>
+    <w:p>
+      <w:pPr>
+        <w:spacing w:after="80" w:line="276" w:lineRule="auto"/>
+      </w:pPr>
+      <w:r>
+        <w:rPr>
+          <w:rFonts w:ascii="Times New Roman" w:hAnsi="Times New Roman"/>
+          <w:sz w:val="22"/>
+        </w:rPr>
+        <w:t>1. Xây dựng Báo cáo Tổng kết nhiệm kỳ và Phương hướng công tác nhiệm kỳ mới.</w:t>
+      </w:r>
+    </w:p>
+    <w:p>
+      <w:pPr>
+        <w:spacing w:after="80" w:line="276" w:lineRule="auto"/>
+      </w:pPr>
+      <w:r>
+        <w:rPr>
+          <w:rFonts w:ascii="Times New Roman" w:hAnsi="Times New Roman"/>
+          <w:sz w:val="22"/>
+        </w:rPr>
+        <w:t>2. Lập Đề án Nhân sự Ban Chấp hành Chi đoàn (Bí thư, Phó Bí thư, Ủy viên) trình Ban Thường vụ Đoàn Khoa duyệt.</w:t>
+      </w:r>
+    </w:p>
+    <w:p>
+      <w:pPr>
+        <w:spacing w:after="80" w:line="276" w:lineRule="auto"/>
+      </w:pPr>
+      <w:r>
+        <w:rPr>
+          <w:rFonts w:ascii="Times New Roman" w:hAnsi="Times New Roman"/>
+          <w:sz w:val="22"/>
+        </w:rPr>
+        <w:t>3. Chuẩn bị tài liệu: Phiếu bầu cử đóng dấu treo của Đoàn Khoa, danh sách đoàn viên tham gia có quyền biểu quyết.</w:t>
+      </w:r>
+    </w:p>
+    <w:p>
+      <w:pPr>
+        <w:pStyle w:val="Heading2"/>
+        <w:spacing w:before="200" w:after="80"/>
+      </w:pPr>
+      <w:r>
+        <w:rPr>
+          <w:rFonts w:ascii="Times New Roman" w:hAnsi="Times New Roman"/>
+          <w:b/>
+          <w:color w:val="1B365D"/>
+          <w:sz w:val="24"/>
+        </w:rPr>
+        <w:t>11.2. Kịch bản Điều hành Phiên Đại hội Chính thức</w:t>
+      </w:r>
+    </w:p>
+    <w:p>
+      <w:pPr>
+        <w:spacing w:after="80" w:line="276" w:lineRule="auto"/>
+      </w:pPr>
+      <w:r>
+        <w:rPr>
+          <w:rFonts w:ascii="Times New Roman" w:hAnsi="Times New Roman"/>
+          <w:sz w:val="22"/>
+        </w:rPr>
+        <w:t>• Nghi thức: Chào cờ (Quốc ca, Đoàn ca), tuyên bố lý do, giới thiệu đại biểu.</w:t>
+      </w:r>
+    </w:p>
+    <w:p>
+      <w:pPr>
+        <w:spacing w:after="80" w:line="276" w:lineRule="auto"/>
+      </w:pPr>
+      <w:r>
+        <w:rPr>
+          <w:rFonts w:ascii="Times New Roman" w:hAnsi="Times New Roman"/>
+          <w:sz w:val="22"/>
+        </w:rPr>
+        <w:t>• Bầu Đoàn Chủ tịch (03 đồng chí) và Đoàn Thư ký (02 đồng chí) bằng hình thức biểu quyết giơ tay.</w:t>
+      </w:r>
+    </w:p>
+    <w:p>
+      <w:pPr>
+        <w:spacing w:after="80" w:line="276" w:lineRule="auto"/>
+      </w:pPr>
+      <w:r>
+        <w:rPr>
+          <w:rFonts w:ascii="Times New Roman" w:hAnsi="Times New Roman"/>
+          <w:sz w:val="22"/>
+        </w:rPr>
+        <w:t>• Trình bày Báo cáo tổng kết và Báo cáo kiểm điểm của Ban Chấp hành cũ.</w:t>
+      </w:r>
+    </w:p>
+    <w:p>
+      <w:pPr>
+        <w:spacing w:after="80" w:line="276" w:lineRule="auto"/>
+      </w:pPr>
+      <w:r>
+        <w:rPr>
+          <w:rFonts w:ascii="Times New Roman" w:hAnsi="Times New Roman"/>
+          <w:sz w:val="22"/>
+        </w:rPr>
+        <w:t>• Tiến hành bầu cử: Bầu Ban Kiểm phiếu -&gt; Phát phiếu bầu kín -&gt; Thu phiếu và niêm phong hòm phiếu -&gt; Kiểm phiếu -&gt; Công bố biên bản kiểm phiếu và ra mắt Ban Chấp hành khóa mới.</w:t>
+      </w:r>
+    </w:p>
+    <w:p>
+      <w:pPr>
+        <w:pStyle w:val="Heading1"/>
+        <w:spacing w:before="280" w:after="120"/>
+      </w:pPr>
+      <w:r>
+        <w:rPr>
+          <w:rFonts w:ascii="Times New Roman" w:hAnsi="Times New Roman"/>
+          <w:b/>
+          <w:color w:val="003366"/>
+          <w:sz w:val="28"/>
+        </w:rPr>
+        <w:t>PHẦN 12: SỔ TAY QUẢN TRỊ TRUYỀN THÔNG VÀ TUYỂN THÀNH VIÊN (GEN RECRUITMENT)</w:t>
+      </w:r>
+    </w:p>
+    <w:p>
+      <w:pPr>
+        <w:spacing w:after="80" w:line="276" w:lineRule="auto"/>
+      </w:pPr>
+      <w:r>
+        <w:rPr>
+          <w:rFonts w:ascii="Times New Roman" w:hAnsi="Times New Roman"/>
+          <w:sz w:val="22"/>
+        </w:rPr>
+        <w:t>Quy trình 30 ngày chuẩn mực để tổ chức một mùa tuyển quân (Gen Recruitment) thành công và chuyên nghiệp cho CLB - Đội - Nhóm:</w:t>
+      </w:r>
+    </w:p>
+    <w:p>
+      <w:pPr>
+        <w:spacing w:after="80" w:line="276" w:lineRule="auto"/>
+      </w:pPr>
+      <w:r>
+        <w:rPr>
+          <w:rFonts w:ascii="Times New Roman" w:hAnsi="Times New Roman"/>
+          <w:b/>
+          <w:color w:val="003366"/>
+          <w:sz w:val="22"/>
+        </w:rPr>
+        <w:t xml:space="preserve">1. Tuần 1: </w:t>
+      </w:r>
+      <w:r>
+        <w:rPr>
+          <w:rFonts w:ascii="Times New Roman" w:hAnsi="Times New Roman"/>
+          <w:sz w:val="22"/>
+        </w:rPr>
+        <w:t>Giai đoạn 1: Tiền sự kiện (Teaser &amp; Awareness - Tuần 1):</w:t>
+      </w:r>
+    </w:p>
+    <w:p>
+      <w:pPr>
+        <w:spacing w:after="80" w:line="276" w:lineRule="auto"/>
+      </w:pPr>
+      <w:r>
+        <w:rPr>
+          <w:rFonts w:ascii="Times New Roman" w:hAnsi="Times New Roman"/>
+          <w:sz w:val="22"/>
+        </w:rPr>
+        <w:t>Đăng tải video teaser, hình ảnh bí ẩn (Hint/Countdown), bài viết chia sẻ về văn hóa và giá trị cốt lõi của CLB.</w:t>
+      </w:r>
+    </w:p>
+    <w:p>
+      <w:pPr>
+        <w:spacing w:after="80" w:line="276" w:lineRule="auto"/>
+      </w:pPr>
+      <w:r>
+        <w:rPr>
+          <w:rFonts w:ascii="Times New Roman" w:hAnsi="Times New Roman"/>
+          <w:b/>
+          <w:color w:val="003366"/>
+          <w:sz w:val="22"/>
+        </w:rPr>
+        <w:t xml:space="preserve">2. Tuần 2: </w:t>
+      </w:r>
+      <w:r>
+        <w:rPr>
+          <w:rFonts w:ascii="Times New Roman" w:hAnsi="Times New Roman"/>
+          <w:sz w:val="22"/>
+        </w:rPr>
+        <w:t>Giai đoạn 2: Mở đơn đăng ký chính thức (Opening Application Form - Tuần 2):</w:t>
+      </w:r>
+    </w:p>
+    <w:p>
+      <w:pPr>
+        <w:spacing w:after="80" w:line="276" w:lineRule="auto"/>
+      </w:pPr>
+      <w:r>
+        <w:rPr>
+          <w:rFonts w:ascii="Times New Roman" w:hAnsi="Times New Roman"/>
+          <w:sz w:val="22"/>
+        </w:rPr>
+        <w:t>Công bố Booklet tuyển thành viên, mô tả công việc (JD) từng Ban (Nội dung, Truyền thông, Hậu cần, Đối ngoại, Nhân sự); tổ chức buổi Livestream Q&amp;A giải đáp thắc mắc cho tân sinh viên.</w:t>
+      </w:r>
+    </w:p>
+    <w:p>
+      <w:pPr>
+        <w:spacing w:after="80" w:line="276" w:lineRule="auto"/>
+      </w:pPr>
+      <w:r>
+        <w:rPr>
+          <w:rFonts w:ascii="Times New Roman" w:hAnsi="Times New Roman"/>
+          <w:b/>
+          <w:color w:val="003366"/>
+          <w:sz w:val="22"/>
+        </w:rPr>
+        <w:t xml:space="preserve">3. Tuần 3: </w:t>
+      </w:r>
+      <w:r>
+        <w:rPr>
+          <w:rFonts w:ascii="Times New Roman" w:hAnsi="Times New Roman"/>
+          <w:sz w:val="22"/>
+        </w:rPr>
+        <w:t>Giai đoạn 3: Phỏng vấn và Hoạt động Nhóm (Assessment &amp; Interview - Tuần 3):</w:t>
+      </w:r>
+    </w:p>
+    <w:p>
+      <w:pPr>
+        <w:spacing w:after="80" w:line="276" w:lineRule="auto"/>
+      </w:pPr>
+      <w:r>
+        <w:rPr>
+          <w:rFonts w:ascii="Times New Roman" w:hAnsi="Times New Roman"/>
+          <w:sz w:val="22"/>
+        </w:rPr>
+        <w:t>Tổ chức vòng Teamwork thực tế (Case study) và phỏng vấn cá nhân 1-1; quan sát thái độ, tinh thần trách nhiệm và sự phù hợp văn hóa.</w:t>
+      </w:r>
+    </w:p>
+    <w:p>
+      <w:pPr>
+        <w:spacing w:after="80" w:line="276" w:lineRule="auto"/>
+      </w:pPr>
+      <w:r>
+        <w:rPr>
+          <w:rFonts w:ascii="Times New Roman" w:hAnsi="Times New Roman"/>
+          <w:b/>
+          <w:color w:val="003366"/>
+          <w:sz w:val="22"/>
+        </w:rPr>
+        <w:t xml:space="preserve">4. Tuần 4: </w:t>
+      </w:r>
+      <w:r>
+        <w:rPr>
+          <w:rFonts w:ascii="Times New Roman" w:hAnsi="Times New Roman"/>
+          <w:sz w:val="22"/>
+        </w:rPr>
+        <w:t>Giai đoạn 4: Công bố kết quả và Onboarding (Welcome New Gen - Tuần 4):</w:t>
+      </w:r>
+    </w:p>
+    <w:p>
+      <w:pPr>
+        <w:spacing w:after="80" w:line="276" w:lineRule="auto"/>
+      </w:pPr>
+      <w:r>
+        <w:rPr>
+          <w:rFonts w:ascii="Times New Roman" w:hAnsi="Times New Roman"/>
+          <w:sz w:val="22"/>
+        </w:rPr>
+        <w:t>Gửi email chúc mừng trúng tuyển (Welcome Letter) kèm hướng dẫn tham gia nhóm sinh hoạt; gửi email cảm ơn chân thành và động viên đối với các ứng viên chưa phù hợp trong đợt này.</w:t>
+      </w:r>
+    </w:p>
     <w:sectPr>
       <w:pgSz w:w="12240" w:h="15840"/>
       <w:pgMar w:top="1440" w:right="1440" w:bottom="1440" w:left="1440" w:header="720" w:footer="720" w:gutter="0"/>

</xml_diff>